<commit_message>
Fix heading hierarchy, spacing and objectives in project report
- Fixed style spacing: H1 18/6pt, H2 12/4pt, H3 8/3pt, Normal/SUBHEADING 0/6pt
- Removed duplicate 'Introduction' H2 under INTRODUCTION H1
- Removed duplicate 'Problem Statement' H2
- Removed duplicate 'Literature review' H2 under Literature Review H1
- Trimmed 35 excessive blank paragraphs (max 1 blank between sections)
- Merged two Objectives into one concise statement

Co-Authored-By: Claude Sonnet 4.6 <noreply@anthropic.com>
</commit_message>
<xml_diff>
--- a/nischal_nepal360.docx
+++ b/nischal_nepal360.docx
@@ -86,18 +86,6 @@
       <w:bookmarkEnd w:id="5"/>
       <w:bookmarkEnd w:id="6"/>
       <w:bookmarkEnd w:id="7"/>
-    </w:p>
-    <w:p>
-      <w:pPr>
-        <w:spacing w:line="360" w:lineRule="auto"/>
-        <w:jc w:val="center"/>
-        <w:rPr>
-          <w:rFonts w:ascii="Times New Roman" w:hAnsi="Times New Roman" w:cs="Times New Roman"/>
-          <w:color w:val="000000" w:themeColor="text1"/>
-          <w:sz w:val="24"/>
-          <w:szCs w:val="24"/>
-        </w:rPr>
-      </w:pPr>
     </w:p>
     <w:p>
       <w:pPr>
@@ -6596,14 +6584,6 @@
     </w:p>
     <w:p>
       <w:pPr>
-        <w:spacing w:line="360" w:lineRule="auto"/>
-      </w:pPr>
-      <w:r>
-        <w:br w:type="page"/>
-      </w:r>
-    </w:p>
-    <w:p>
-      <w:pPr>
         <w:pStyle w:val="heading16"/>
         <w:spacing w:line="360" w:lineRule="auto"/>
         <w:rPr>
@@ -8024,20 +8004,6 @@
     </w:p>
     <w:p>
       <w:pPr>
-        <w:pStyle w:val="Heading2"/>
-      </w:pPr>
-      <w:bookmarkStart w:id="15" w:name="_Toc190874902"/>
-      <w:bookmarkStart w:id="16" w:name="_Toc191012910"/>
-      <w:bookmarkStart w:id="17" w:name="_Toc226695347"/>
-      <w:r>
-        <w:t>Introduction</w:t>
-      </w:r>
-      <w:bookmarkEnd w:id="15"/>
-      <w:bookmarkEnd w:id="16"/>
-      <w:bookmarkEnd w:id="17"/>
-    </w:p>
-    <w:p>
-      <w:pPr>
         <w:pStyle w:val="SUBHEADING"/>
         <w:spacing w:line="360" w:lineRule="auto"/>
         <w:jc w:val="both"/>
@@ -8122,16 +8088,6 @@
         <w:lastRenderedPageBreak/>
         <w:t>solution for modern crowdfunding in Nepal, bridging the gap between those who need help and those who want to help.</w:t>
       </w:r>
-    </w:p>
-    <w:p>
-      <w:pPr>
-        <w:pStyle w:val="Heading2"/>
-      </w:pPr>
-      <w:bookmarkStart w:id="21" w:name="_Toc226695349"/>
-      <w:r>
-        <w:t>Problem Statement</w:t>
-      </w:r>
-      <w:bookmarkEnd w:id="21"/>
     </w:p>
     <w:p>
       <w:pPr>
@@ -8268,39 +8224,7 @@
         </w:rPr>
       </w:pPr>
       <w:r>
-        <w:rPr>
-          <w:b w:val="0"/>
-          <w:color w:val="000000" w:themeColor="text1"/>
-          <w:sz w:val="24"/>
-          <w:szCs w:val="24"/>
-        </w:rPr>
-        <w:t>To develop a centralized and verified crowdfunding platform for Nepal that enables transparent campaign creation, secure donation processing through Khalti, and comprehensive donor engagement through gamification features.</w:t>
-      </w:r>
-    </w:p>
-    <w:p>
-      <w:pPr>
-        <w:pStyle w:val="SUBHEADING"/>
-        <w:numPr>
-          <w:ilvl w:val="0"/>
-          <w:numId w:val="20"/>
-        </w:numPr>
-        <w:spacing w:line="360" w:lineRule="auto"/>
-        <w:jc w:val="both"/>
-        <w:rPr>
-          <w:b w:val="0"/>
-          <w:color w:val="000000" w:themeColor="text1"/>
-          <w:sz w:val="24"/>
-          <w:szCs w:val="24"/>
-        </w:rPr>
-      </w:pPr>
-      <w:r>
-        <w:rPr>
-          <w:b w:val="0"/>
-          <w:color w:val="000000" w:themeColor="text1"/>
-          <w:sz w:val="24"/>
-          <w:szCs w:val="24"/>
-        </w:rPr>
-        <w:t>To implement a robust KYC verification system and admin oversight workflow that ensures campaign authenticity and builds donor trust, while providing secure digital payments and role-based access control.</w:t>
+        <w:t xml:space="preserve">To develop Nepal360, a centralized and transparent crowdfunding platform for Nepal, with KYC-based campaign verification, secure Khalti payment processing, admin oversight, and donor engagement through gamification.</w:t>
       </w:r>
     </w:p>
     <w:p>
@@ -9091,20 +9015,6 @@
         </w:rPr>
         <w:t>Nepal360 aims to address these gaps by providing a comprehensive, Nepal-specific crowdfunding platform that combines trust-building mechanisms like KYC verification and admin oversight with modern features like AI predictions, gamification, and multi-language support. By integrating Khalti, Nepal’s leading digital payment gateway, the platform ensures accessible and secure donation processing for the Nepali population.</w:t>
       </w:r>
-    </w:p>
-    <w:p>
-      <w:pPr>
-        <w:pStyle w:val="Heading2"/>
-      </w:pPr>
-      <w:bookmarkStart w:id="39" w:name="_Toc190874909"/>
-      <w:bookmarkStart w:id="40" w:name="_Toc191012917"/>
-      <w:bookmarkStart w:id="41" w:name="_Toc226695357"/>
-      <w:r>
-        <w:t>Literature review</w:t>
-      </w:r>
-      <w:bookmarkEnd w:id="39"/>
-      <w:bookmarkEnd w:id="40"/>
-      <w:bookmarkEnd w:id="41"/>
     </w:p>
     <w:p>
       <w:pPr>
@@ -10253,101 +10163,6 @@
     </w:p>
     <w:p>
       <w:pPr>
-        <w:spacing w:line="360" w:lineRule="auto"/>
-        <w:rPr>
-          <w:rFonts w:ascii="Times New Roman" w:hAnsi="Times New Roman" w:cs="Times New Roman"/>
-          <w:iCs/>
-          <w:color w:val="000000" w:themeColor="text1"/>
-          <w:sz w:val="24"/>
-          <w:szCs w:val="24"/>
-        </w:rPr>
-      </w:pPr>
-    </w:p>
-    <w:p>
-      <w:pPr>
-        <w:spacing w:line="360" w:lineRule="auto"/>
-        <w:rPr>
-          <w:rFonts w:ascii="Times New Roman" w:hAnsi="Times New Roman" w:cs="Times New Roman"/>
-          <w:iCs/>
-          <w:color w:val="000000" w:themeColor="text1"/>
-          <w:sz w:val="24"/>
-          <w:szCs w:val="24"/>
-        </w:rPr>
-      </w:pPr>
-    </w:p>
-    <w:p>
-      <w:pPr>
-        <w:spacing w:line="360" w:lineRule="auto"/>
-        <w:rPr>
-          <w:rFonts w:ascii="Times New Roman" w:hAnsi="Times New Roman" w:cs="Times New Roman"/>
-          <w:iCs/>
-          <w:color w:val="000000" w:themeColor="text1"/>
-          <w:sz w:val="24"/>
-          <w:szCs w:val="24"/>
-        </w:rPr>
-      </w:pPr>
-    </w:p>
-    <w:p>
-      <w:pPr>
-        <w:spacing w:line="360" w:lineRule="auto"/>
-        <w:rPr>
-          <w:rFonts w:ascii="Times New Roman" w:hAnsi="Times New Roman" w:cs="Times New Roman"/>
-          <w:iCs/>
-          <w:color w:val="000000" w:themeColor="text1"/>
-          <w:sz w:val="24"/>
-          <w:szCs w:val="24"/>
-        </w:rPr>
-      </w:pPr>
-    </w:p>
-    <w:p>
-      <w:pPr>
-        <w:spacing w:line="360" w:lineRule="auto"/>
-        <w:rPr>
-          <w:rFonts w:ascii="Times New Roman" w:hAnsi="Times New Roman" w:cs="Times New Roman"/>
-          <w:iCs/>
-          <w:color w:val="000000" w:themeColor="text1"/>
-          <w:sz w:val="24"/>
-          <w:szCs w:val="24"/>
-        </w:rPr>
-      </w:pPr>
-    </w:p>
-    <w:p>
-      <w:pPr>
-        <w:spacing w:line="360" w:lineRule="auto"/>
-        <w:rPr>
-          <w:rFonts w:ascii="Times New Roman" w:hAnsi="Times New Roman" w:cs="Times New Roman"/>
-          <w:iCs/>
-          <w:color w:val="000000" w:themeColor="text1"/>
-          <w:sz w:val="24"/>
-          <w:szCs w:val="24"/>
-        </w:rPr>
-      </w:pPr>
-    </w:p>
-    <w:p>
-      <w:pPr>
-        <w:spacing w:line="360" w:lineRule="auto"/>
-        <w:rPr>
-          <w:rFonts w:ascii="Times New Roman" w:hAnsi="Times New Roman" w:cs="Times New Roman"/>
-          <w:iCs/>
-          <w:color w:val="000000" w:themeColor="text1"/>
-          <w:sz w:val="24"/>
-          <w:szCs w:val="24"/>
-        </w:rPr>
-      </w:pPr>
-    </w:p>
-    <w:p>
-      <w:pPr>
-        <w:pStyle w:val="SUBHEADING"/>
-        <w:spacing w:line="360" w:lineRule="auto"/>
-        <w:rPr>
-          <w:color w:val="000000" w:themeColor="text1"/>
-          <w:sz w:val="24"/>
-          <w:szCs w:val="24"/>
-        </w:rPr>
-      </w:pPr>
-    </w:p>
-    <w:p>
-      <w:pPr>
         <w:pStyle w:val="Heading3"/>
         <w:rPr>
           <w:rFonts w:cs="Times New Roman"/>
@@ -10818,87 +10633,6 @@
     </w:p>
     <w:p>
       <w:pPr>
-        <w:spacing w:line="360" w:lineRule="auto"/>
-        <w:jc w:val="both"/>
-        <w:rPr>
-          <w:rFonts w:ascii="Times New Roman" w:hAnsi="Times New Roman" w:cs="Times New Roman"/>
-          <w:sz w:val="24"/>
-        </w:rPr>
-      </w:pPr>
-    </w:p>
-    <w:p>
-      <w:pPr>
-        <w:spacing w:line="360" w:lineRule="auto"/>
-        <w:jc w:val="both"/>
-        <w:rPr>
-          <w:rFonts w:ascii="Times New Roman" w:hAnsi="Times New Roman" w:cs="Times New Roman"/>
-          <w:sz w:val="24"/>
-        </w:rPr>
-      </w:pPr>
-    </w:p>
-    <w:p>
-      <w:pPr>
-        <w:spacing w:line="360" w:lineRule="auto"/>
-        <w:jc w:val="both"/>
-        <w:rPr>
-          <w:rFonts w:ascii="Times New Roman" w:hAnsi="Times New Roman" w:cs="Times New Roman"/>
-          <w:sz w:val="24"/>
-        </w:rPr>
-      </w:pPr>
-    </w:p>
-    <w:p>
-      <w:pPr>
-        <w:spacing w:line="360" w:lineRule="auto"/>
-        <w:jc w:val="both"/>
-        <w:rPr>
-          <w:rFonts w:ascii="Times New Roman" w:hAnsi="Times New Roman" w:cs="Times New Roman"/>
-          <w:sz w:val="24"/>
-        </w:rPr>
-      </w:pPr>
-    </w:p>
-    <w:p>
-      <w:pPr>
-        <w:spacing w:line="360" w:lineRule="auto"/>
-        <w:jc w:val="both"/>
-        <w:rPr>
-          <w:rFonts w:ascii="Times New Roman" w:hAnsi="Times New Roman" w:cs="Times New Roman"/>
-          <w:sz w:val="24"/>
-        </w:rPr>
-      </w:pPr>
-    </w:p>
-    <w:p>
-      <w:pPr>
-        <w:spacing w:line="360" w:lineRule="auto"/>
-        <w:jc w:val="both"/>
-        <w:rPr>
-          <w:rFonts w:ascii="Times New Roman" w:hAnsi="Times New Roman" w:cs="Times New Roman"/>
-          <w:sz w:val="24"/>
-        </w:rPr>
-      </w:pPr>
-    </w:p>
-    <w:p>
-      <w:pPr>
-        <w:spacing w:line="360" w:lineRule="auto"/>
-        <w:jc w:val="both"/>
-        <w:rPr>
-          <w:rFonts w:ascii="Times New Roman" w:hAnsi="Times New Roman" w:cs="Times New Roman"/>
-          <w:sz w:val="24"/>
-        </w:rPr>
-      </w:pPr>
-    </w:p>
-    <w:p>
-      <w:pPr>
-        <w:spacing w:line="360" w:lineRule="auto"/>
-        <w:jc w:val="center"/>
-        <w:rPr>
-          <w:rFonts w:ascii="Times New Roman" w:hAnsi="Times New Roman" w:cs="Times New Roman"/>
-          <w:b/>
-          <w:sz w:val="24"/>
-        </w:rPr>
-      </w:pPr>
-    </w:p>
-    <w:p>
-      <w:pPr>
         <w:pStyle w:val="Heading3"/>
         <w:rPr>
           <w:rFonts w:cs="Times New Roman"/>
@@ -11362,56 +11096,6 @@
         <w:spacing w:line="360" w:lineRule="auto"/>
         <w:rPr>
           <w:rFonts w:ascii="Times New Roman" w:hAnsi="Times New Roman" w:cs="Times New Roman"/>
-        </w:rPr>
-      </w:pPr>
-    </w:p>
-    <w:p>
-      <w:pPr>
-        <w:spacing w:line="360" w:lineRule="auto"/>
-        <w:rPr>
-          <w:rFonts w:ascii="Times New Roman" w:hAnsi="Times New Roman" w:cs="Times New Roman"/>
-        </w:rPr>
-      </w:pPr>
-    </w:p>
-    <w:p>
-      <w:pPr>
-        <w:spacing w:line="360" w:lineRule="auto"/>
-        <w:rPr>
-          <w:rFonts w:ascii="Times New Roman" w:hAnsi="Times New Roman" w:cs="Times New Roman"/>
-        </w:rPr>
-      </w:pPr>
-    </w:p>
-    <w:p>
-      <w:pPr>
-        <w:spacing w:line="360" w:lineRule="auto"/>
-        <w:rPr>
-          <w:rFonts w:ascii="Times New Roman" w:hAnsi="Times New Roman" w:cs="Times New Roman"/>
-        </w:rPr>
-      </w:pPr>
-    </w:p>
-    <w:p>
-      <w:pPr>
-        <w:spacing w:line="360" w:lineRule="auto"/>
-        <w:rPr>
-          <w:rFonts w:ascii="Times New Roman" w:hAnsi="Times New Roman" w:cs="Times New Roman"/>
-        </w:rPr>
-      </w:pPr>
-    </w:p>
-    <w:p>
-      <w:pPr>
-        <w:spacing w:line="360" w:lineRule="auto"/>
-        <w:rPr>
-          <w:rFonts w:ascii="Times New Roman" w:hAnsi="Times New Roman" w:cs="Times New Roman"/>
-        </w:rPr>
-      </w:pPr>
-    </w:p>
-    <w:p>
-      <w:pPr>
-        <w:spacing w:line="360" w:lineRule="auto"/>
-        <w:jc w:val="center"/>
-        <w:rPr>
-          <w:rFonts w:ascii="Times New Roman" w:hAnsi="Times New Roman" w:cs="Times New Roman"/>
-          <w:b/>
         </w:rPr>
       </w:pPr>
     </w:p>
@@ -11959,104 +11643,6 @@
     </w:p>
     <w:p>
       <w:pPr>
-        <w:pStyle w:val="SUBHEADING"/>
-        <w:spacing w:line="360" w:lineRule="auto"/>
-        <w:jc w:val="center"/>
-        <w:rPr>
-          <w:color w:val="000000" w:themeColor="text1"/>
-          <w:sz w:val="24"/>
-          <w:szCs w:val="24"/>
-        </w:rPr>
-      </w:pPr>
-    </w:p>
-    <w:p>
-      <w:pPr>
-        <w:pStyle w:val="SUBHEADING"/>
-        <w:spacing w:line="360" w:lineRule="auto"/>
-        <w:jc w:val="center"/>
-        <w:rPr>
-          <w:color w:val="000000" w:themeColor="text1"/>
-          <w:sz w:val="24"/>
-          <w:szCs w:val="24"/>
-        </w:rPr>
-      </w:pPr>
-    </w:p>
-    <w:p>
-      <w:pPr>
-        <w:pStyle w:val="SUBHEADING"/>
-        <w:spacing w:line="360" w:lineRule="auto"/>
-        <w:jc w:val="center"/>
-        <w:rPr>
-          <w:color w:val="000000" w:themeColor="text1"/>
-          <w:sz w:val="24"/>
-          <w:szCs w:val="24"/>
-        </w:rPr>
-      </w:pPr>
-    </w:p>
-    <w:p>
-      <w:pPr>
-        <w:pStyle w:val="SUBHEADING"/>
-        <w:spacing w:line="360" w:lineRule="auto"/>
-        <w:jc w:val="center"/>
-        <w:rPr>
-          <w:color w:val="000000" w:themeColor="text1"/>
-          <w:sz w:val="24"/>
-          <w:szCs w:val="24"/>
-        </w:rPr>
-      </w:pPr>
-    </w:p>
-    <w:p>
-      <w:pPr>
-        <w:pStyle w:val="SUBHEADING"/>
-        <w:spacing w:line="360" w:lineRule="auto"/>
-        <w:jc w:val="center"/>
-        <w:rPr>
-          <w:color w:val="000000" w:themeColor="text1"/>
-          <w:sz w:val="24"/>
-          <w:szCs w:val="24"/>
-        </w:rPr>
-      </w:pPr>
-    </w:p>
-    <w:p>
-      <w:pPr>
-        <w:spacing w:line="360" w:lineRule="auto"/>
-        <w:jc w:val="center"/>
-        <w:rPr>
-          <w:rFonts w:ascii="Times New Roman" w:hAnsi="Times New Roman" w:cs="Times New Roman"/>
-          <w:b/>
-        </w:rPr>
-      </w:pPr>
-    </w:p>
-    <w:p>
-      <w:pPr>
-        <w:pStyle w:val="SUBHEADING"/>
-        <w:spacing w:line="360" w:lineRule="auto"/>
-        <w:jc w:val="center"/>
-        <w:rPr>
-          <w:color w:val="000000" w:themeColor="text1"/>
-          <w:sz w:val="24"/>
-          <w:szCs w:val="24"/>
-        </w:rPr>
-      </w:pPr>
-      <w:r>
-        <w:rPr>
-          <w:color w:val="000000" w:themeColor="text1"/>
-          <w:sz w:val="24"/>
-          <w:szCs w:val="24"/>
-        </w:rPr>
-        <w:br w:type="page"/>
-      </w:r>
-    </w:p>
-    <w:p>
-      <w:pPr>
-        <w:spacing w:line="360" w:lineRule="auto"/>
-        <w:rPr>
-          <w:rFonts w:ascii="Times New Roman" w:hAnsi="Times New Roman" w:cs="Times New Roman"/>
-        </w:rPr>
-      </w:pPr>
-    </w:p>
-    <w:p>
-      <w:pPr>
         <w:pStyle w:val="Heading1"/>
       </w:pPr>
       <w:bookmarkStart w:id="69" w:name="_Toc190874910"/>
@@ -13830,29 +13416,6 @@
     </w:p>
     <w:p>
       <w:pPr>
-        <w:spacing w:line="360" w:lineRule="auto"/>
-        <w:rPr>
-          <w:rFonts w:ascii="Times New Roman" w:hAnsi="Times New Roman" w:cs="Times New Roman"/>
-          <w:iCs/>
-          <w:color w:val="000000" w:themeColor="text1"/>
-          <w:sz w:val="24"/>
-          <w:szCs w:val="24"/>
-        </w:rPr>
-      </w:pPr>
-      <w:r>
-        <w:rPr>
-          <w:rFonts w:ascii="Times New Roman" w:hAnsi="Times New Roman" w:cs="Times New Roman"/>
-          <w:i/>
-          <w:color w:val="000000" w:themeColor="text1"/>
-          <w:sz w:val="24"/>
-          <w:szCs w:val="24"/>
-        </w:rPr>
-        <w:lastRenderedPageBreak/>
-        <w:br w:type="page"/>
-      </w:r>
-    </w:p>
-    <w:p>
-      <w:pPr>
         <w:pStyle w:val="Heading3"/>
         <w:jc w:val="both"/>
         <w:rPr>
@@ -14237,32 +13800,6 @@
           <w:sz w:val="24"/>
         </w:rPr>
       </w:pPr>
-    </w:p>
-    <w:p>
-      <w:pPr>
-        <w:spacing w:line="360" w:lineRule="auto"/>
-        <w:jc w:val="both"/>
-        <w:rPr>
-          <w:rFonts w:ascii="Times New Roman" w:hAnsi="Times New Roman" w:cs="Times New Roman"/>
-          <w:sz w:val="24"/>
-        </w:rPr>
-      </w:pPr>
-    </w:p>
-    <w:p>
-      <w:pPr>
-        <w:spacing w:line="360" w:lineRule="auto"/>
-        <w:rPr>
-          <w:rFonts w:ascii="Times New Roman" w:hAnsi="Times New Roman" w:cs="Times New Roman"/>
-          <w:sz w:val="24"/>
-        </w:rPr>
-      </w:pPr>
-      <w:r>
-        <w:rPr>
-          <w:rFonts w:ascii="Times New Roman" w:hAnsi="Times New Roman" w:cs="Times New Roman"/>
-          <w:sz w:val="24"/>
-        </w:rPr>
-        <w:br w:type="page"/>
-      </w:r>
     </w:p>
     <w:p>
       <w:pPr>
@@ -29388,6 +28925,9 @@
     <w:name w:val="Normal"/>
     <w:qFormat/>
     <w:rsid w:val="0012684E"/>
+    <w:pPr>
+      <w:spacing w:before="0" w:after="120"/>
+    </w:pPr>
   </w:style>
   <w:style w:type="paragraph" w:styleId="Heading1">
     <w:name w:val="heading 1"/>
@@ -29404,7 +28944,7 @@
       <w:numPr>
         <w:numId w:val="12"/>
       </w:numPr>
-      <w:spacing w:before="240" w:after="0" w:line="360" w:lineRule="auto"/>
+      <w:spacing w:before="360" w:after="120" w:line="360" w:lineRule="auto"/>
       <w:jc w:val="center"/>
       <w:outlineLvl w:val="0"/>
     </w:pPr>
@@ -29437,7 +28977,7 @@
         <w:ilvl w:val="1"/>
         <w:numId w:val="12"/>
       </w:numPr>
-      <w:spacing w:before="40" w:after="0" w:line="360" w:lineRule="auto"/>
+      <w:spacing w:before="240" w:after="80" w:line="360" w:lineRule="auto"/>
       <w:ind w:left="0"/>
       <w:jc w:val="both"/>
       <w:outlineLvl w:val="1"/>
@@ -29466,7 +29006,7 @@
         <w:ilvl w:val="2"/>
         <w:numId w:val="12"/>
       </w:numPr>
-      <w:spacing w:before="40" w:after="0" w:line="360" w:lineRule="auto"/>
+      <w:spacing w:before="160" w:after="60" w:line="360" w:lineRule="auto"/>
       <w:outlineLvl w:val="2"/>
     </w:pPr>
     <w:rPr>
@@ -29493,7 +29033,7 @@
         <w:ilvl w:val="3"/>
         <w:numId w:val="12"/>
       </w:numPr>
-      <w:spacing w:before="40" w:after="0"/>
+      <w:spacing w:before="120" w:after="40"/>
       <w:ind w:left="0"/>
       <w:outlineLvl w:val="3"/>
     </w:pPr>
@@ -29578,6 +29118,9 @@
     <w:link w:val="SUBHEADINGChar"/>
     <w:qFormat/>
     <w:rsid w:val="00292E02"/>
+    <w:pPr>
+      <w:spacing w:before="0" w:after="120"/>
+    </w:pPr>
     <w:rPr>
       <w:rFonts w:ascii="Times New Roman" w:hAnsi="Times New Roman" w:cs="Times New Roman"/>
       <w:b/>

</xml_diff>